<commit_message>
feat(log-007): usar la nueva version de la plantilla LOG-007-F
- Se actualiza templates/LOG-007-F.docx (y la copia en la raiz) con la nueva
  version: firma de CPE, datos de la representante y casillas "( )".
- El tipo de terminal se marca con "( X )" reconociendo casillas "( )"
  partidas en varios fragmentos (y "○" de versiones anteriores).
- El bloque de firmas respeta los datos de CPE que trae la plantilla y solo
  llena los campos vacios.
- Se actualiza la version de cache de los scripts en index.html.

Co-Authored-By: Claude Opus 5.5 <noreply@anthropic.com>
</commit_message>
<xml_diff>
--- a/LOG-007-F LEGALIZACIO_N Y ENTREGA DIRECTA DE EQUIPOS.docx
+++ b/LOG-007-F LEGALIZACIO_N Y ENTREGA DIRECTA DE EQUIPOS.docx
@@ -107,7 +107,6 @@
                 <w:iCs/>
                 <w:sz w:val="20"/>
                 <w:szCs w:val="20"/>
-                <w:highlight w:val="red"/>
               </w:rPr>
             </w:pPr>
           </w:p>
@@ -528,13 +527,32 @@
                 <w:szCs w:val="20"/>
               </w:rPr>
             </w:pPr>
+            <w:proofErr w:type="gramStart"/>
             <w:r>
               <w:rPr>
                 <w:rFonts w:ascii="Arial" w:eastAsia="Yu Gothic UI Semilight" w:hAnsi="Arial" w:cs="Arial"/>
                 <w:sz w:val="20"/>
                 <w:szCs w:val="20"/>
               </w:rPr>
-              <w:t>○</w:t>
+              <w:t xml:space="preserve">(  </w:t>
+            </w:r>
+            <w:proofErr w:type="gramEnd"/>
+            <w:r>
+              <w:rPr>
+                <w:rFonts w:ascii="Arial" w:eastAsia="Yu Gothic UI Semilight" w:hAnsi="Arial" w:cs="Arial"/>
+                <w:sz w:val="20"/>
+                <w:szCs w:val="20"/>
+              </w:rPr>
+              <w:t xml:space="preserve"> </w:t>
+            </w:r>
+            <w:proofErr w:type="gramStart"/>
+            <w:r>
+              <w:rPr>
+                <w:rFonts w:ascii="Arial" w:eastAsia="Yu Gothic UI Semilight" w:hAnsi="Arial" w:cs="Arial"/>
+                <w:sz w:val="20"/>
+                <w:szCs w:val="20"/>
+              </w:rPr>
+              <w:t xml:space="preserve">) </w:t>
             </w:r>
             <w:r>
               <w:rPr>
@@ -559,24 +577,60 @@
                 <w:sz w:val="20"/>
                 <w:szCs w:val="20"/>
               </w:rPr>
-              <w:t xml:space="preserve">      </w:t>
-            </w:r>
-            <w:r>
-              <w:rPr>
-                <w:rFonts w:ascii="Verdana" w:eastAsia="Yu Gothic UI Semilight" w:hAnsi="Verdana" w:cs="Arial"/>
+              <w:t xml:space="preserve">   </w:t>
+            </w:r>
+            <w:r>
+              <w:rPr>
+                <w:rFonts w:ascii="Arial" w:eastAsia="Yu Gothic UI Semilight" w:hAnsi="Arial" w:cs="Arial"/>
                 <w:sz w:val="20"/>
                 <w:szCs w:val="20"/>
               </w:rPr>
+              <w:t>(</w:t>
+            </w:r>
+            <w:proofErr w:type="gramEnd"/>
+            <w:r>
+              <w:rPr>
+                <w:rFonts w:ascii="Arial" w:eastAsia="Yu Gothic UI Semilight" w:hAnsi="Arial" w:cs="Arial"/>
+                <w:sz w:val="20"/>
+                <w:szCs w:val="20"/>
+              </w:rPr>
               <w:t xml:space="preserve"> </w:t>
             </w:r>
+            <w:proofErr w:type="gramStart"/>
             <w:r>
               <w:rPr>
                 <w:rFonts w:ascii="Arial" w:eastAsia="Yu Gothic UI Semilight" w:hAnsi="Arial" w:cs="Arial"/>
                 <w:sz w:val="20"/>
                 <w:szCs w:val="20"/>
               </w:rPr>
-              <w:t>○</w:t>
-            </w:r>
+              <w:t xml:space="preserve"> </w:t>
+            </w:r>
+            <w:r>
+              <w:rPr>
+                <w:rFonts w:ascii="Arial" w:eastAsia="Yu Gothic UI Semilight" w:hAnsi="Arial" w:cs="Arial"/>
+                <w:sz w:val="20"/>
+                <w:szCs w:val="20"/>
+              </w:rPr>
+              <w:t xml:space="preserve"> </w:t>
+            </w:r>
+            <w:r>
+              <w:rPr>
+                <w:rFonts w:ascii="Arial" w:eastAsia="Yu Gothic UI Semilight" w:hAnsi="Arial" w:cs="Arial"/>
+                <w:sz w:val="20"/>
+                <w:szCs w:val="20"/>
+              </w:rPr>
+              <w:t>)</w:t>
+            </w:r>
+            <w:proofErr w:type="gramEnd"/>
+            <w:r>
+              <w:rPr>
+                <w:rFonts w:ascii="Arial" w:eastAsia="Yu Gothic UI Semilight" w:hAnsi="Arial" w:cs="Arial"/>
+                <w:sz w:val="20"/>
+                <w:szCs w:val="20"/>
+              </w:rPr>
+              <w:t xml:space="preserve"> </w:t>
+            </w:r>
+            <w:proofErr w:type="gramStart"/>
             <w:r>
               <w:rPr>
                 <w:rFonts w:ascii="Verdana" w:hAnsi="Verdana" w:cs="Arial"/>
@@ -592,7 +646,7 @@
                 <w:sz w:val="20"/>
                 <w:szCs w:val="20"/>
               </w:rPr>
-              <w:t xml:space="preserve">   </w:t>
+              <w:t xml:space="preserve"> </w:t>
             </w:r>
             <w:r>
               <w:rPr>
@@ -600,7 +654,34 @@
                 <w:sz w:val="20"/>
                 <w:szCs w:val="20"/>
               </w:rPr>
-              <w:t>○</w:t>
+              <w:t>(</w:t>
+            </w:r>
+            <w:proofErr w:type="gramEnd"/>
+            <w:r>
+              <w:rPr>
+                <w:rFonts w:ascii="Arial" w:eastAsia="Yu Gothic UI Semilight" w:hAnsi="Arial" w:cs="Arial"/>
+                <w:sz w:val="20"/>
+                <w:szCs w:val="20"/>
+              </w:rPr>
+              <w:t xml:space="preserve"> </w:t>
+            </w:r>
+            <w:proofErr w:type="gramStart"/>
+            <w:r>
+              <w:rPr>
+                <w:rFonts w:ascii="Arial" w:eastAsia="Yu Gothic UI Semilight" w:hAnsi="Arial" w:cs="Arial"/>
+                <w:sz w:val="20"/>
+                <w:szCs w:val="20"/>
+              </w:rPr>
+              <w:t xml:space="preserve">  )</w:t>
+            </w:r>
+            <w:proofErr w:type="gramEnd"/>
+            <w:r>
+              <w:rPr>
+                <w:rFonts w:ascii="Arial" w:eastAsia="Yu Gothic UI Semilight" w:hAnsi="Arial" w:cs="Arial"/>
+                <w:sz w:val="20"/>
+                <w:szCs w:val="20"/>
+              </w:rPr>
+              <w:t xml:space="preserve"> </w:t>
             </w:r>
             <w:r>
               <w:rPr>
@@ -609,7 +690,7 @@
                 <w:sz w:val="20"/>
                 <w:szCs w:val="20"/>
               </w:rPr>
-              <w:t>Otro ¿Cuál? _________</w:t>
+              <w:t>Otro ¿Cuál? ____</w:t>
             </w:r>
           </w:p>
         </w:tc>
@@ -1652,6 +1733,113 @@
                 <w:szCs w:val="22"/>
               </w:rPr>
             </w:pPr>
+            <w:r>
+              <w:rPr>
+                <w:rFonts w:ascii="Verdana" w:hAnsi="Verdana" w:cs="Arial"/>
+                <w:b/>
+                <w:bCs/>
+                <w:noProof/>
+                <w:sz w:val="22"/>
+                <w:szCs w:val="22"/>
+              </w:rPr>
+              <w:drawing>
+                <wp:anchor distT="0" distB="0" distL="114300" distR="114300" simplePos="0" relativeHeight="251659264" behindDoc="0" locked="0" layoutInCell="1" allowOverlap="1" wp14:anchorId="12ABEB77" wp14:editId="39F262E8">
+                  <wp:simplePos x="0" y="0"/>
+                  <wp:positionH relativeFrom="column">
+                    <wp:posOffset>428625</wp:posOffset>
+                  </wp:positionH>
+                  <wp:positionV relativeFrom="paragraph">
+                    <wp:posOffset>158115</wp:posOffset>
+                  </wp:positionV>
+                  <wp:extent cx="1303655" cy="619125"/>
+                  <wp:effectExtent l="0" t="0" r="0" b="9525"/>
+                  <wp:wrapNone/>
+                  <wp:docPr id="552010827" name="Imagen 3"/>
+                  <wp:cNvGraphicFramePr>
+                    <a:graphicFrameLocks xmlns:a="http://schemas.openxmlformats.org/drawingml/2006/main" noChangeAspect="1"/>
+                  </wp:cNvGraphicFramePr>
+                  <a:graphic xmlns:a="http://schemas.openxmlformats.org/drawingml/2006/main">
+                    <a:graphicData uri="http://schemas.openxmlformats.org/drawingml/2006/picture">
+                      <pic:pic xmlns:pic="http://schemas.openxmlformats.org/drawingml/2006/picture">
+                        <pic:nvPicPr>
+                          <pic:cNvPr id="552010827" name="Imagen 552010827"/>
+                          <pic:cNvPicPr/>
+                        </pic:nvPicPr>
+                        <pic:blipFill>
+                          <a:blip r:embed="rId12">
+                            <a:extLst>
+                              <a:ext uri="{28A0092B-C50C-407E-A947-70E740481C1C}">
+                                <a14:useLocalDpi xmlns:a14="http://schemas.microsoft.com/office/drawing/2010/main" val="0"/>
+                              </a:ext>
+                            </a:extLst>
+                          </a:blip>
+                          <a:stretch>
+                            <a:fillRect/>
+                          </a:stretch>
+                        </pic:blipFill>
+                        <pic:spPr>
+                          <a:xfrm>
+                            <a:off x="0" y="0"/>
+                            <a:ext cx="1303655" cy="619125"/>
+                          </a:xfrm>
+                          <a:prstGeom prst="rect">
+                            <a:avLst/>
+                          </a:prstGeom>
+                        </pic:spPr>
+                      </pic:pic>
+                    </a:graphicData>
+                  </a:graphic>
+                  <wp14:sizeRelH relativeFrom="margin">
+                    <wp14:pctWidth>0</wp14:pctWidth>
+                  </wp14:sizeRelH>
+                  <wp14:sizeRelV relativeFrom="margin">
+                    <wp14:pctHeight>0</wp14:pctHeight>
+                  </wp14:sizeRelV>
+                </wp:anchor>
+              </w:drawing>
+            </w:r>
+          </w:p>
+          <w:p>
+            <w:pPr>
+              <w:tabs>
+                <w:tab w:val="left" w:pos="1741"/>
+              </w:tabs>
+              <w:rPr>
+                <w:rFonts w:ascii="Verdana" w:hAnsi="Verdana" w:cs="Arial"/>
+                <w:b/>
+                <w:bCs/>
+                <w:sz w:val="22"/>
+                <w:szCs w:val="22"/>
+              </w:rPr>
+            </w:pPr>
+          </w:p>
+          <w:p>
+            <w:pPr>
+              <w:tabs>
+                <w:tab w:val="left" w:pos="1741"/>
+              </w:tabs>
+              <w:rPr>
+                <w:rFonts w:ascii="Verdana" w:hAnsi="Verdana" w:cs="Arial"/>
+                <w:b/>
+                <w:bCs/>
+                <w:sz w:val="22"/>
+                <w:szCs w:val="22"/>
+              </w:rPr>
+            </w:pPr>
+          </w:p>
+          <w:p>
+            <w:pPr>
+              <w:tabs>
+                <w:tab w:val="left" w:pos="1741"/>
+              </w:tabs>
+              <w:rPr>
+                <w:rFonts w:ascii="Verdana" w:hAnsi="Verdana" w:cs="Arial"/>
+                <w:b/>
+                <w:bCs/>
+                <w:sz w:val="22"/>
+                <w:szCs w:val="22"/>
+              </w:rPr>
+            </w:pPr>
           </w:p>
           <w:p>
             <w:pPr>
@@ -2003,6 +2191,22 @@
               </w:rPr>
               <w:t>Nombre:</w:t>
             </w:r>
+            <w:r>
+              <w:rPr>
+                <w:rFonts w:ascii="Verdana" w:hAnsi="Verdana" w:cs="Arial"/>
+                <w:sz w:val="20"/>
+                <w:szCs w:val="20"/>
+              </w:rPr>
+              <w:t xml:space="preserve"> </w:t>
+            </w:r>
+            <w:r>
+              <w:rPr>
+                <w:rFonts w:ascii="Verdana" w:hAnsi="Verdana" w:cs="Arial"/>
+                <w:sz w:val="20"/>
+                <w:szCs w:val="20"/>
+              </w:rPr>
+              <w:t>YUBY CATERINE BOHÓRQUEZ ROJAS</w:t>
+            </w:r>
           </w:p>
         </w:tc>
         <w:tc>
@@ -2152,6 +2356,22 @@
               </w:rPr>
               <w:t>No. identificación:</w:t>
             </w:r>
+            <w:r>
+              <w:rPr>
+                <w:rFonts w:ascii="Verdana" w:hAnsi="Verdana" w:cs="Arial"/>
+                <w:sz w:val="20"/>
+                <w:szCs w:val="20"/>
+              </w:rPr>
+              <w:t xml:space="preserve"> </w:t>
+            </w:r>
+            <w:r>
+              <w:rPr>
+                <w:rFonts w:ascii="Verdana" w:hAnsi="Verdana" w:cs="Arial"/>
+                <w:sz w:val="20"/>
+                <w:szCs w:val="20"/>
+              </w:rPr>
+              <w:t>52.497.293</w:t>
+            </w:r>
           </w:p>
         </w:tc>
         <w:tc>
@@ -2301,6 +2521,22 @@
               </w:rPr>
               <w:t>Celular:</w:t>
             </w:r>
+            <w:r>
+              <w:rPr>
+                <w:rFonts w:ascii="Verdana" w:hAnsi="Verdana" w:cs="Arial"/>
+                <w:sz w:val="20"/>
+                <w:szCs w:val="20"/>
+              </w:rPr>
+              <w:t xml:space="preserve"> </w:t>
+            </w:r>
+            <w:r>
+              <w:rPr>
+                <w:rFonts w:ascii="Verdana" w:hAnsi="Verdana" w:cs="Arial"/>
+                <w:sz w:val="20"/>
+                <w:szCs w:val="20"/>
+              </w:rPr>
+              <w:t>52.497.293</w:t>
+            </w:r>
           </w:p>
         </w:tc>
         <w:tc>
@@ -2450,6 +2686,22 @@
               </w:rPr>
               <w:t>Correo:</w:t>
             </w:r>
+            <w:r>
+              <w:rPr>
+                <w:rFonts w:ascii="Verdana" w:hAnsi="Verdana" w:cs="Arial"/>
+                <w:sz w:val="20"/>
+                <w:szCs w:val="20"/>
+              </w:rPr>
+              <w:t xml:space="preserve"> </w:t>
+            </w:r>
+            <w:r>
+              <w:rPr>
+                <w:rFonts w:ascii="Verdana" w:hAnsi="Verdana" w:cs="Arial"/>
+                <w:sz w:val="20"/>
+                <w:szCs w:val="20"/>
+              </w:rPr>
+              <w:t>ybohorquez@cpe.gov.co</w:t>
+            </w:r>
           </w:p>
         </w:tc>
         <w:tc>
@@ -2596,6 +2848,22 @@
                 <w:szCs w:val="20"/>
               </w:rPr>
               <w:t>Cargo:</w:t>
+            </w:r>
+            <w:r>
+              <w:rPr>
+                <w:rFonts w:ascii="Verdana" w:hAnsi="Verdana" w:cs="Arial"/>
+                <w:sz w:val="20"/>
+                <w:szCs w:val="20"/>
+              </w:rPr>
+              <w:t xml:space="preserve"> </w:t>
+            </w:r>
+            <w:r>
+              <w:rPr>
+                <w:rFonts w:ascii="Verdana" w:hAnsi="Verdana" w:cs="Arial"/>
+                <w:sz w:val="20"/>
+                <w:szCs w:val="20"/>
+              </w:rPr>
+              <w:t>Profesional Logístico</w:t>
             </w:r>
           </w:p>
         </w:tc>
@@ -3231,8 +3499,8 @@
           <w:lang w:val="pt-PT"/>
         </w:rPr>
         <w:sectPr>
-          <w:headerReference w:type="default" r:id="rId12"/>
-          <w:footerReference w:type="default" r:id="rId13"/>
+          <w:headerReference w:type="default" r:id="rId13"/>
+          <w:footerReference w:type="default" r:id="rId14"/>
           <w:pgSz w:w="12240" w:h="15840"/>
           <w:pgMar w:top="1469" w:right="1701" w:bottom="992" w:left="1701" w:header="709" w:footer="709" w:gutter="0"/>
           <w:cols w:space="708"/>
@@ -5473,7 +5741,7 @@
       </w:r>
     </w:p>
     <w:sectPr>
-      <w:headerReference w:type="default" r:id="rId14"/>
+      <w:headerReference w:type="default" r:id="rId15"/>
       <w:pgSz w:w="15840" w:h="12240" w:orient="landscape"/>
       <w:pgMar w:top="1276" w:right="956" w:bottom="1701" w:left="992" w:header="709" w:footer="709" w:gutter="0"/>
       <w:cols w:space="708"/>
@@ -8070,6 +8338,16 @@
 </file>
 
 <file path=customXml/item1.xml><?xml version="1.0" encoding="utf-8"?>
+<p:properties xmlns:p="http://schemas.microsoft.com/office/2006/metadata/properties" xmlns:xsi="http://www.w3.org/2001/XMLSchema-instance" xmlns:pc="http://schemas.microsoft.com/office/infopath/2007/PartnerControls">
+  <documentManagement/>
+</p:properties>
+</file>
+
+<file path=customXml/item2.xml><?xml version="1.0" encoding="utf-8"?>
+<b:Sources xmlns:b="http://schemas.openxmlformats.org/officeDocument/2006/bibliography" xmlns="http://schemas.openxmlformats.org/officeDocument/2006/bibliography" SelectedStyle="\APASixthEditionOfficeOnline.xsl" StyleName="APA" Version="6"/>
+</file>
+
+<file path=customXml/item3.xml><?xml version="1.0" encoding="utf-8"?>
 <ct:contentTypeSchema xmlns:ct="http://schemas.microsoft.com/office/2006/metadata/contentType" xmlns:ma="http://schemas.microsoft.com/office/2006/metadata/properties/metaAttributes" ct:_="" ma:_="" ma:contentTypeName="Document" ma:contentTypeID="0x010100A30B331C4838804993200D47FCE41471" ma:contentTypeVersion="11" ma:contentTypeDescription="Create a new document." ma:contentTypeScope="" ma:versionID="d9801eb647fd58e56a8b175437891573">
   <xsd:schema xmlns:xsd="http://www.w3.org/2001/XMLSchema" xmlns:xs="http://www.w3.org/2001/XMLSchema" xmlns:p="http://schemas.microsoft.com/office/2006/metadata/properties" xmlns:ns3="2e532581-20e9-408c-a3d6-754b6c32e08b" xmlns:ns4="ab9f0e5a-eb09-4b64-a8eb-5db8af803633" targetNamespace="http://schemas.microsoft.com/office/2006/metadata/properties" ma:root="true" ma:fieldsID="c3d21b39ec3e984babe6119bab9014b0" ns3:_="" ns4:_="">
     <xsd:import namespace="2e532581-20e9-408c-a3d6-754b6c32e08b"/>
@@ -8278,16 +8556,6 @@
 </ct:contentTypeSchema>
 </file>
 
-<file path=customXml/item2.xml><?xml version="1.0" encoding="utf-8"?>
-<b:Sources xmlns:b="http://schemas.openxmlformats.org/officeDocument/2006/bibliography" xmlns="http://schemas.openxmlformats.org/officeDocument/2006/bibliography" SelectedStyle="\APASixthEditionOfficeOnline.xsl" StyleName="APA" Version="6"/>
-</file>
-
-<file path=customXml/item3.xml><?xml version="1.0" encoding="utf-8"?>
-<p:properties xmlns:p="http://schemas.microsoft.com/office/2006/metadata/properties" xmlns:xsi="http://www.w3.org/2001/XMLSchema-instance" xmlns:pc="http://schemas.microsoft.com/office/infopath/2007/PartnerControls">
-  <documentManagement/>
-</p:properties>
-</file>
-
 <file path=customXml/item4.xml><?xml version="1.0" encoding="utf-8"?>
 <?mso-contentType ?>
 <FormTemplates xmlns="http://schemas.microsoft.com/sharepoint/v3/contenttype/forms">
@@ -8298,6 +8566,23 @@
 </file>
 
 <file path=customXml/itemProps1.xml><?xml version="1.0" encoding="utf-8"?>
+<ds:datastoreItem xmlns:ds="http://schemas.openxmlformats.org/officeDocument/2006/customXml" ds:itemID="{8B7F66FD-9D04-4EC5-B43D-084D53B4EF9C}">
+  <ds:schemaRefs>
+    <ds:schemaRef ds:uri="http://schemas.microsoft.com/office/2006/metadata/properties"/>
+    <ds:schemaRef ds:uri="http://schemas.microsoft.com/office/infopath/2007/PartnerControls"/>
+  </ds:schemaRefs>
+</ds:datastoreItem>
+</file>
+
+<file path=customXml/itemProps2.xml><?xml version="1.0" encoding="utf-8"?>
+<ds:datastoreItem xmlns:ds="http://schemas.openxmlformats.org/officeDocument/2006/customXml" ds:itemID="{273F679F-9FD1-4033-8859-4F0F279958DA}">
+  <ds:schemaRefs>
+    <ds:schemaRef ds:uri="http://schemas.openxmlformats.org/officeDocument/2006/bibliography"/>
+  </ds:schemaRefs>
+</ds:datastoreItem>
+</file>
+
+<file path=customXml/itemProps3.xml><?xml version="1.0" encoding="utf-8"?>
 <ds:datastoreItem xmlns:ds="http://schemas.openxmlformats.org/officeDocument/2006/customXml" ds:itemID="{36349CA1-45D6-4016-A788-A8C5D419407B}">
   <ds:schemaRefs>
     <ds:schemaRef ds:uri="http://schemas.microsoft.com/office/2006/metadata/contentType"/>
@@ -8316,23 +8601,6 @@
 </ds:datastoreItem>
 </file>
 
-<file path=customXml/itemProps2.xml><?xml version="1.0" encoding="utf-8"?>
-<ds:datastoreItem xmlns:ds="http://schemas.openxmlformats.org/officeDocument/2006/customXml" ds:itemID="{273F679F-9FD1-4033-8859-4F0F279958DA}">
-  <ds:schemaRefs>
-    <ds:schemaRef ds:uri="http://schemas.openxmlformats.org/officeDocument/2006/bibliography"/>
-  </ds:schemaRefs>
-</ds:datastoreItem>
-</file>
-
-<file path=customXml/itemProps3.xml><?xml version="1.0" encoding="utf-8"?>
-<ds:datastoreItem xmlns:ds="http://schemas.openxmlformats.org/officeDocument/2006/customXml" ds:itemID="{8B7F66FD-9D04-4EC5-B43D-084D53B4EF9C}">
-  <ds:schemaRefs>
-    <ds:schemaRef ds:uri="http://schemas.microsoft.com/office/2006/metadata/properties"/>
-    <ds:schemaRef ds:uri="http://schemas.microsoft.com/office/infopath/2007/PartnerControls"/>
-  </ds:schemaRefs>
-</ds:datastoreItem>
-</file>
-
 <file path=customXml/itemProps4.xml><?xml version="1.0" encoding="utf-8"?>
 <ds:datastoreItem xmlns:ds="http://schemas.openxmlformats.org/officeDocument/2006/customXml" ds:itemID="{0AD0403F-4538-4F35-895B-4A73F29FF4F4}">
   <ds:schemaRefs>

</xml_diff>